<commit_message>
fix: replace Android with phone users in site review
</commit_message>
<xml_diff>
--- a/docs/infanity-site-review.docx
+++ b/docs/infanity-site-review.docx
@@ -171,7 +171,7 @@
           <w:i w:val="0"/>
           <w:sz w:val="22"/>
         </w:rPr>
-        <w:t>Most visitors will not download on the first visit. A waitlist for Android, a newsletter signup, or even just social links (TikTok, Instagram, Discord) would let InFanity stay in touch with curious visitors rather than losing them forever.</w:t>
+        <w:t>Most visitors will not download on the first visit. A waitlist for phone users, a newsletter signup, or even just social links (TikTok, Instagram, Discord) would let InFanity stay in touch with curious visitors rather than losing them forever.</w:t>
       </w:r>
     </w:p>
     <w:p>
@@ -193,7 +193,7 @@
           <w:i w:val="0"/>
           <w:sz w:val="22"/>
         </w:rPr>
-        <w:t>The site only links to the iOS App Store. Android represents roughly 70% of global mobile users. Even a simple "Android coming soon" waitlist signals inclusivity and captures demand.</w:t>
+        <w:t>The site only links to the iOS App Store. phone users represents roughly 70% of global mobile users. Even a simple "phone users coming soon" waitlist signals inclusivity and captures demand.</w:t>
       </w:r>
     </w:p>
     <w:p>
@@ -316,7 +316,7 @@
         <w:rPr>
           <w:sz w:val="22"/>
         </w:rPr>
-        <w:t>Build waitlist and lead-capture flows for Android users, artists, and general newsletter subscribers.</w:t>
+        <w:t>Build waitlist and lead-capture flows for phone users users, artists, and general newsletter subscribers.</w:t>
       </w:r>
     </w:p>
     <w:p>
@@ -373,7 +373,7 @@
         <w:rPr>
           <w:sz w:val="22"/>
         </w:rPr>
-        <w:t>Develop a Progressive Web App (PWA) or web companion to serve Android and desktop users.</w:t>
+        <w:t>Develop a Progressive Web App (PWA) or web companion to serve phone users and desktop users.</w:t>
       </w:r>
     </w:p>
     <w:p>

</xml_diff>

<commit_message>
fix: revert Android to phone users selectively - keep in platform reach where iOS/Android distinction matters
</commit_message>
<xml_diff>
--- a/docs/infanity-site-review.docx
+++ b/docs/infanity-site-review.docx
@@ -193,7 +193,7 @@
           <w:i w:val="0"/>
           <w:sz w:val="22"/>
         </w:rPr>
-        <w:t>The site only links to the iOS App Store. phone users represents roughly 70% of global mobile users. Even a simple "phone users coming soon" waitlist signals inclusivity and captures demand.</w:t>
+        <w:t>The site only links to the iOS App Store. Android represents roughly 70% of global mobile users. Even a simple "Android coming soon" waitlist signals inclusivity and captures demand.</w:t>
       </w:r>
     </w:p>
     <w:p>
@@ -316,7 +316,7 @@
         <w:rPr>
           <w:sz w:val="22"/>
         </w:rPr>
-        <w:t>Build waitlist and lead-capture flows for phone users users, artists, and general newsletter subscribers.</w:t>
+        <w:t>Build waitlist and lead-capture flows for phone users, artists, and general newsletter subscribers.</w:t>
       </w:r>
     </w:p>
     <w:p>

</xml_diff>

<commit_message>
fix: Android users in rec [29] to match platform gap insight
</commit_message>
<xml_diff>
--- a/docs/infanity-site-review.docx
+++ b/docs/infanity-site-review.docx
@@ -1,521 +1,521 @@
 
 <file path=word/document.xml><?xml version="1.0" encoding="utf-8"?>
-<w:document xmlns:wpc="http://schemas.microsoft.com/office/word/2010/wordprocessingCanvas" xmlns:mo="http://schemas.microsoft.com/office/mac/office/2008/main" xmlns:mc="http://schemas.openxmlformats.org/markup-compatibility/2006" xmlns:mv="urn:schemas-microsoft-com:mac:vml" xmlns:o="urn:schemas-microsoft-com:office:office" xmlns:r="http://schemas.openxmlformats.org/officeDocument/2006/relationships" xmlns:m="http://schemas.openxmlformats.org/officeDocument/2006/math" xmlns:v="urn:schemas-microsoft-com:vml" xmlns:wp14="http://schemas.microsoft.com/office/word/2010/wordprocessingDrawing" xmlns:wp="http://schemas.openxmlformats.org/drawingml/2006/wordprocessingDrawing" xmlns:w10="urn:schemas-microsoft-com:office:word" xmlns:w="http://schemas.openxmlformats.org/wordprocessingml/2006/main" xmlns:w14="http://schemas.microsoft.com/office/word/2010/wordml" xmlns:wpg="http://schemas.microsoft.com/office/word/2010/wordprocessingGroup" xmlns:wpi="http://schemas.microsoft.com/office/word/2010/wordprocessingInk" xmlns:wne="http://schemas.microsoft.com/office/word/2006/wordml" xmlns:wps="http://schemas.microsoft.com/office/word/2010/wordprocessingShape" mc:Ignorable="w14 wp14">
-  <w:body>
-    <w:p>
-      <w:pPr>
-        <w:pStyle w:val="Title"/>
-        <w:jc w:val="left"/>
-      </w:pPr>
-      <w:r>
-        <w:t>InFanity Site Review &amp; Partnership Opportunities</w:t>
-      </w:r>
-    </w:p>
-    <w:p>
-      <w:r>
-        <w:t>Prepared by TorinWorks for Lesley</w:t>
-      </w:r>
-    </w:p>
-    <w:p>
-      <w:r>
-        <w:t>Date: April 27, 2026</w:t>
-      </w:r>
-    </w:p>
-    <w:p>
-      <w:r>
-        <w:t>Site reviewed: https://infanity.xyz/</w:t>
-      </w:r>
-    </w:p>
-    <w:p/>
-    <w:p>
-      <w:pPr>
-        <w:pStyle w:val="Heading1"/>
-        <w:jc w:val="left"/>
-      </w:pPr>
-      <w:r>
-        <w:t>1. What InFanity Is Doing Well</w:t>
-      </w:r>
-    </w:p>
-    <w:p>
-      <w:pPr>
-        <w:spacing w:after="160" w:line="240" w:lineRule="auto"/>
-      </w:pPr>
-      <w:r>
-        <w:rPr>
-          <w:b w:val="0"/>
-          <w:i w:val="0"/>
-          <w:sz w:val="22"/>
-        </w:rPr>
-        <w:t>Before diving into opportunities, it is worth highlighting what already works:</w:t>
-      </w:r>
-    </w:p>
-    <w:p>
-      <w:pPr>
-        <w:pStyle w:val="ListBullet"/>
-        <w:spacing w:after="80"/>
-      </w:pPr>
-      <w:r>
-        <w:rPr>
-          <w:sz w:val="22"/>
-        </w:rPr>
-        <w:t>Bold visual identity: The yellow-to-black gradient hero is energetic, memorable, and clearly signals a music-oriented brand.</w:t>
-      </w:r>
-    </w:p>
-    <w:p>
-      <w:pPr>
-        <w:pStyle w:val="ListBullet"/>
-        <w:spacing w:after="80"/>
-      </w:pPr>
-      <w:r>
-        <w:rPr>
-          <w:sz w:val="22"/>
-        </w:rPr>
-        <w:t>Shipped product: InFanity is live on the App Store. That alone puts it ahead of most ideas that never launch.</w:t>
-      </w:r>
-    </w:p>
-    <w:p>
-      <w:pPr>
-        <w:pStyle w:val="ListBullet"/>
-        <w:spacing w:after="80"/>
-      </w:pPr>
-      <w:r>
-        <w:rPr>
-          <w:sz w:val="22"/>
-        </w:rPr>
-        <w:t>Strong name: "InFanity" is catchy, short, and ties "fan" to "infinity" -- great brand recall.</w:t>
-      </w:r>
-    </w:p>
-    <w:p/>
-    <w:p>
-      <w:pPr>
-        <w:pStyle w:val="Heading1"/>
-        <w:jc w:val="left"/>
-      </w:pPr>
-      <w:r>
-        <w:t>2. Opportunities We See</w:t>
-      </w:r>
-    </w:p>
-    <w:p>
-      <w:pPr>
-        <w:spacing w:after="160" w:line="240" w:lineRule="auto"/>
-      </w:pPr>
-      <w:r>
-        <w:rPr>
-          <w:b w:val="0"/>
-          <w:i w:val="0"/>
-          <w:sz w:val="22"/>
-        </w:rPr>
-        <w:t>The current site is a single hero section. That is a clean start, but it leaves a lot of the story untold. Here are the biggest opportunities for improvement:</w:t>
-      </w:r>
-    </w:p>
-    <w:p>
-      <w:pPr>
-        <w:pStyle w:val="Heading2"/>
-        <w:jc w:val="left"/>
-      </w:pPr>
-      <w:r>
-        <w:t>Tell the full story</w:t>
-      </w:r>
-    </w:p>
-    <w:p>
-      <w:pPr>
-        <w:spacing w:after="160" w:line="240" w:lineRule="auto"/>
-      </w:pPr>
-      <w:r>
-        <w:rPr>
-          <w:b w:val="0"/>
-          <w:i w:val="0"/>
-          <w:sz w:val="22"/>
-        </w:rPr>
-        <w:t>Right now a visitor sees "Where Music Connects" and a download button. They do not know if this is a fan club, a messaging app, a ticketing tool, or a social network. A few sections explaining the core loop -- "discover artists -&gt; message them -&gt; unlock exclusive content" -- would dramatically improve conversion.</w:t>
-      </w:r>
-    </w:p>
-    <w:p>
-      <w:pPr>
-        <w:pStyle w:val="Heading2"/>
-        <w:jc w:val="left"/>
-      </w:pPr>
-      <w:r>
-        <w:t>Add trust signals</w:t>
-      </w:r>
-    </w:p>
-    <w:p>
-      <w:pPr>
-        <w:spacing w:after="160" w:line="240" w:lineRule="auto"/>
-      </w:pPr>
-      <w:r>
-        <w:rPr>
-          <w:b w:val="0"/>
-          <w:i w:val="0"/>
-          <w:sz w:val="22"/>
-        </w:rPr>
-        <w:t>For an app requesting downloads and likely social permissions, trust is essential. A privacy policy, an About page, and a simple contact email go a long way toward making users feel safe.</w:t>
-      </w:r>
-    </w:p>
-    <w:p>
-      <w:pPr>
-        <w:pStyle w:val="Heading2"/>
-        <w:jc w:val="left"/>
-      </w:pPr>
-      <w:r>
-        <w:t>Capture the non-downloaders</w:t>
-      </w:r>
-    </w:p>
-    <w:p>
-      <w:pPr>
-        <w:spacing w:after="160" w:line="240" w:lineRule="auto"/>
-      </w:pPr>
-      <w:r>
-        <w:rPr>
-          <w:b w:val="0"/>
-          <w:i w:val="0"/>
-          <w:sz w:val="22"/>
-        </w:rPr>
-        <w:t>Most visitors will not download on the first visit. A waitlist for phone users, a newsletter signup, or even just social links (TikTok, Instagram, Discord) would let InFanity stay in touch with curious visitors rather than losing them forever.</w:t>
-      </w:r>
-    </w:p>
-    <w:p>
-      <w:pPr>
-        <w:pStyle w:val="Heading2"/>
-        <w:jc w:val="left"/>
-      </w:pPr>
-      <w:r>
-        <w:t>Expand platform reach</w:t>
-      </w:r>
-    </w:p>
-    <w:p>
-      <w:pPr>
-        <w:spacing w:after="160" w:line="240" w:lineRule="auto"/>
-      </w:pPr>
-      <w:r>
-        <w:rPr>
-          <w:b w:val="0"/>
-          <w:i w:val="0"/>
-          <w:sz w:val="22"/>
-        </w:rPr>
-        <w:t>The site only links to the iOS App Store. Android represents roughly 70% of global mobile users. Even a simple "Android coming soon" waitlist signals inclusivity and captures demand.</w:t>
-      </w:r>
-    </w:p>
-    <w:p>
-      <w:pPr>
-        <w:pStyle w:val="Heading2"/>
-        <w:jc w:val="left"/>
-      </w:pPr>
-      <w:r>
-        <w:t>SEO and discoverability</w:t>
-      </w:r>
-    </w:p>
-    <w:p>
-      <w:pPr>
-        <w:spacing w:after="160" w:line="240" w:lineRule="auto"/>
-      </w:pPr>
-      <w:r>
-        <w:rPr>
-          <w:b w:val="0"/>
-          <w:i w:val="0"/>
-          <w:sz w:val="22"/>
-        </w:rPr>
-        <w:t>The meta description is literally "Where Music Connects." Adding keyword-rich copy, a blog, or landing pages for terms like "fan engagement app" or "direct artist messaging" would bring in organic traffic that currently goes to competitors.</w:t>
-      </w:r>
-    </w:p>
-    <w:p/>
-    <w:p>
-      <w:pPr>
-        <w:pStyle w:val="Heading1"/>
-        <w:jc w:val="left"/>
-      </w:pPr>
-      <w:r>
-        <w:t>3. How TorinWorks Can Help</w:t>
-      </w:r>
-    </w:p>
-    <w:p>
-      <w:pPr>
-        <w:spacing w:after="160" w:line="240" w:lineRule="auto"/>
-      </w:pPr>
-      <w:r>
-        <w:rPr>
-          <w:b w:val="0"/>
-          <w:i w:val="0"/>
-          <w:sz w:val="22"/>
-        </w:rPr>
-        <w:t>TorinWorks specializes in turning promising products into polished, conversion-ready web experiences. Here is how we would partner with InFanity:</w:t>
-      </w:r>
-    </w:p>
-    <w:p>
-      <w:pPr>
-        <w:pStyle w:val="Heading2"/>
-        <w:jc w:val="left"/>
-      </w:pPr>
-      <w:r>
-        <w:t>Phase 1: Foundation (Weeks 1-2)</w:t>
-      </w:r>
-    </w:p>
-    <w:p>
-      <w:pPr>
-        <w:pStyle w:val="ListBullet"/>
-        <w:spacing w:after="80"/>
-      </w:pPr>
-      <w:r>
-        <w:rPr>
-          <w:sz w:val="22"/>
-        </w:rPr>
-        <w:t>Expand the landing page into a full conversion funnel: Hero -&gt; How It Works -&gt; For Fans / For Artists -&gt; Social Proof -&gt; CTA.</w:t>
-      </w:r>
-    </w:p>
-    <w:p>
-      <w:pPr>
-        <w:pStyle w:val="ListBullet"/>
-        <w:spacing w:after="80"/>
-      </w:pPr>
-      <w:r>
-        <w:rPr>
-          <w:sz w:val="22"/>
-        </w:rPr>
-        <w:t>Clarify messaging so visitors understand the value proposition in under 10 seconds.</w:t>
-      </w:r>
-    </w:p>
-    <w:p>
-      <w:pPr>
-        <w:pStyle w:val="ListBullet"/>
-        <w:spacing w:after="80"/>
-      </w:pPr>
-      <w:r>
-        <w:rPr>
-          <w:sz w:val="22"/>
-        </w:rPr>
-        <w:t>Add essential trust pages: Privacy Policy, Terms, About, and Contact.</w:t>
-      </w:r>
-    </w:p>
-    <w:p>
-      <w:pPr>
-        <w:pStyle w:val="ListBullet"/>
-        <w:spacing w:after="80"/>
-      </w:pPr>
-      <w:r>
-        <w:rPr>
-          <w:sz w:val="22"/>
-        </w:rPr>
-        <w:t>Implement SEO basics: meta tags, structured data, sitemap, and keyword-optimized copy.</w:t>
-      </w:r>
-    </w:p>
-    <w:p>
-      <w:pPr>
-        <w:pStyle w:val="Heading2"/>
-        <w:jc w:val="left"/>
-      </w:pPr>
-      <w:r>
-        <w:t>Phase 2: Growth Engine (Month 1-3)</w:t>
-      </w:r>
-    </w:p>
-    <w:p>
-      <w:pPr>
-        <w:pStyle w:val="ListBullet"/>
-        <w:spacing w:after="80"/>
-      </w:pPr>
-      <w:r>
-        <w:rPr>
-          <w:sz w:val="22"/>
-        </w:rPr>
-        <w:t>Build waitlist and lead-capture flows for phone users, artists, and general newsletter subscribers.</w:t>
-      </w:r>
-    </w:p>
-    <w:p>
-      <w:pPr>
-        <w:pStyle w:val="ListBullet"/>
-        <w:spacing w:after="80"/>
-      </w:pPr>
-      <w:r>
-        <w:rPr>
-          <w:sz w:val="22"/>
-        </w:rPr>
-        <w:t>Set up analytics and conversion tracking so every design decision is data-informed.</w:t>
-      </w:r>
-    </w:p>
-    <w:p>
-      <w:pPr>
-        <w:pStyle w:val="ListBullet"/>
-        <w:spacing w:after="80"/>
-      </w:pPr>
-      <w:r>
-        <w:rPr>
-          <w:sz w:val="22"/>
-        </w:rPr>
-        <w:t>Create a content strategy -- blog posts, artist spotlights, case studies -- to drive organic search traffic.</w:t>
-      </w:r>
-    </w:p>
-    <w:p>
-      <w:pPr>
-        <w:pStyle w:val="ListBullet"/>
-        <w:spacing w:after="80"/>
-      </w:pPr>
-      <w:r>
-        <w:rPr>
-          <w:sz w:val="22"/>
-        </w:rPr>
-        <w:t>Establish a social proof pipeline: testimonial collection, partner artist logos, user-generated content.</w:t>
-      </w:r>
-    </w:p>
-    <w:p>
-      <w:pPr>
-        <w:pStyle w:val="Heading2"/>
-        <w:jc w:val="left"/>
-      </w:pPr>
-      <w:r>
-        <w:t>Phase 3: Scale (Ongoing)</w:t>
-      </w:r>
-    </w:p>
-    <w:p>
-      <w:pPr>
-        <w:pStyle w:val="ListBullet"/>
-        <w:spacing w:after="80"/>
-      </w:pPr>
-      <w:r>
-        <w:rPr>
-          <w:sz w:val="22"/>
-        </w:rPr>
-        <w:t>Develop a Progressive Web App (PWA) or web companion to serve phone users and desktop users.</w:t>
-      </w:r>
-    </w:p>
-    <w:p>
-      <w:pPr>
-        <w:pStyle w:val="ListBullet"/>
-        <w:spacing w:after="80"/>
-      </w:pPr>
-      <w:r>
-        <w:rPr>
-          <w:sz w:val="22"/>
-        </w:rPr>
-        <w:t>Integrate AI-powered features: sentiment analysis on fan messages, smart auto-replies for artists, personalized content recommendations.</w:t>
-      </w:r>
-    </w:p>
-    <w:p>
-      <w:pPr>
-        <w:pStyle w:val="ListBullet"/>
-        <w:spacing w:after="80"/>
-      </w:pPr>
-      <w:r>
-        <w:rPr>
-          <w:sz w:val="22"/>
-        </w:rPr>
-        <w:t>Build marketing automation: onboarding drip campaigns, re-engagement flows, artist activation sequences.</w:t>
-      </w:r>
-    </w:p>
-    <w:p>
-      <w:pPr>
-        <w:pStyle w:val="ListBullet"/>
-        <w:spacing w:after="80"/>
-      </w:pPr>
-      <w:r>
-        <w:rPr>
-          <w:sz w:val="22"/>
-        </w:rPr>
-        <w:t>Launch community features: Discord integration, fan club tooling, AMA events.</w:t>
-      </w:r>
-    </w:p>
-    <w:p/>
-    <w:p>
-      <w:pPr>
-        <w:pStyle w:val="Heading1"/>
-        <w:jc w:val="left"/>
-      </w:pPr>
-      <w:r>
-        <w:t>4. Why TorinWorks for InFanity</w:t>
-      </w:r>
-    </w:p>
-    <w:p>
-      <w:pPr>
-        <w:spacing w:after="160" w:line="240" w:lineRule="auto"/>
-      </w:pPr>
-      <w:r>
-        <w:rPr>
-          <w:b w:val="0"/>
-          <w:i w:val="0"/>
-          <w:sz w:val="22"/>
-        </w:rPr>
-        <w:t>TorinWorks does not just build websites -- we build growth infrastructure. For a mobile-first product like InFanity, the web layer is often the most neglected and highest-leverage piece. We help music and community apps become discoverable, trustworthy, and scalable.</w:t>
-      </w:r>
-    </w:p>
-    <w:p/>
-    <w:p>
-      <w:pPr>
-        <w:pStyle w:val="Heading1"/>
-        <w:jc w:val="left"/>
-      </w:pPr>
-      <w:r>
-        <w:t>5. Suggested Next Steps</w:t>
-      </w:r>
-    </w:p>
-    <w:p>
-      <w:pPr>
-        <w:pStyle w:val="ListBullet"/>
-        <w:spacing w:after="80"/>
-      </w:pPr>
-      <w:r>
-        <w:rPr>
-          <w:sz w:val="22"/>
-        </w:rPr>
-        <w:t>Send a short teardown note to InFanity offering the Phase 1 Foundation sprint.</w:t>
-      </w:r>
-    </w:p>
-    <w:p>
-      <w:pPr>
-        <w:pStyle w:val="ListBullet"/>
-        <w:spacing w:after="80"/>
-      </w:pPr>
-      <w:r>
-        <w:rPr>
-          <w:sz w:val="22"/>
-        </w:rPr>
-        <w:t>If they are open to it, schedule a 15-minute intro call to learn their roadmap and tailor the proposal.</w:t>
-      </w:r>
-    </w:p>
-    <w:p>
-      <w:pPr>
-        <w:pStyle w:val="ListBullet"/>
-        <w:spacing w:after="80"/>
-      </w:pPr>
-      <w:r>
-        <w:rPr>
-          <w:sz w:val="22"/>
-        </w:rPr>
-        <w:t>Prepare a 2-slide visual mockup of an expanded landing page to show immediate value.</w:t>
-      </w:r>
-    </w:p>
-    <w:p/>
-    <w:p>
-      <w:pPr>
-        <w:spacing w:after="160" w:line="240" w:lineRule="auto"/>
-      </w:pPr>
-      <w:r>
-        <w:rPr>
-          <w:b w:val="0"/>
-          <w:i/>
-          <w:sz w:val="20"/>
-        </w:rPr>
-        <w:t>For questions or to discuss this review, reach out to Lesley at TorinWorks.</w:t>
-      </w:r>
-    </w:p>
-    <w:p>
-      <w:pPr>
-        <w:spacing w:after="160" w:line="240" w:lineRule="auto"/>
-      </w:pPr>
-      <w:r>
-        <w:rPr>
-          <w:b w:val="0"/>
-          <w:i/>
-          <w:sz w:val="20"/>
-        </w:rPr>
-        <w:t>torinworks.com</w:t>
-      </w:r>
-    </w:p>
-    <w:sectPr>
-      <w:pgSz w:w="12240" w:h="15840"/>
-      <w:pgMar w:top="1440" w:right="1800" w:bottom="1440" w:left="1800" w:header="720" w:footer="720" w:gutter="0"/>
-      <w:cols w:space="720"/>
-      <w:docGrid w:linePitch="360"/>
-    </w:sectPr>
-  </w:body>
-</w:document>
+<ns0:document xmlns:ns0="http://schemas.openxmlformats.org/wordprocessingml/2006/main" xmlns:ns1="http://schemas.openxmlformats.org/markup-compatibility/2006" ns1:Ignorable="w14 wp14">
+  <ns0:body>
+    <ns0:p>
+      <ns0:pPr>
+        <ns0:pStyle ns0:val="Title"/>
+        <ns0:jc ns0:val="left"/>
+      </ns0:pPr>
+      <ns0:r>
+        <ns0:t>InFanity Site Review &amp; Partnership Opportunities</ns0:t>
+      </ns0:r>
+    </ns0:p>
+    <ns0:p>
+      <ns0:r>
+        <ns0:t>Prepared by TorinWorks for Lesley</ns0:t>
+      </ns0:r>
+    </ns0:p>
+    <ns0:p>
+      <ns0:r>
+        <ns0:t>Date: April 27, 2026</ns0:t>
+      </ns0:r>
+    </ns0:p>
+    <ns0:p>
+      <ns0:r>
+        <ns0:t>Site reviewed: https://infanity.xyz/</ns0:t>
+      </ns0:r>
+    </ns0:p>
+    <ns0:p/>
+    <ns0:p>
+      <ns0:pPr>
+        <ns0:pStyle ns0:val="Heading1"/>
+        <ns0:jc ns0:val="left"/>
+      </ns0:pPr>
+      <ns0:r>
+        <ns0:t>1. What InFanity Is Doing Well</ns0:t>
+      </ns0:r>
+    </ns0:p>
+    <ns0:p>
+      <ns0:pPr>
+        <ns0:spacing ns0:after="160" ns0:line="240" ns0:lineRule="auto"/>
+      </ns0:pPr>
+      <ns0:r>
+        <ns0:rPr>
+          <ns0:b ns0:val="0"/>
+          <ns0:i ns0:val="0"/>
+          <ns0:sz ns0:val="22"/>
+        </ns0:rPr>
+        <ns0:t>Before diving into opportunities, it is worth highlighting what already works:</ns0:t>
+      </ns0:r>
+    </ns0:p>
+    <ns0:p>
+      <ns0:pPr>
+        <ns0:pStyle ns0:val="ListBullet"/>
+        <ns0:spacing ns0:after="80"/>
+      </ns0:pPr>
+      <ns0:r>
+        <ns0:rPr>
+          <ns0:sz ns0:val="22"/>
+        </ns0:rPr>
+        <ns0:t>Bold visual identity: The yellow-to-black gradient hero is energetic, memorable, and clearly signals a music-oriented brand.</ns0:t>
+      </ns0:r>
+    </ns0:p>
+    <ns0:p>
+      <ns0:pPr>
+        <ns0:pStyle ns0:val="ListBullet"/>
+        <ns0:spacing ns0:after="80"/>
+      </ns0:pPr>
+      <ns0:r>
+        <ns0:rPr>
+          <ns0:sz ns0:val="22"/>
+        </ns0:rPr>
+        <ns0:t>Shipped product: InFanity is live on the App Store. That alone puts it ahead of most ideas that never launch.</ns0:t>
+      </ns0:r>
+    </ns0:p>
+    <ns0:p>
+      <ns0:pPr>
+        <ns0:pStyle ns0:val="ListBullet"/>
+        <ns0:spacing ns0:after="80"/>
+      </ns0:pPr>
+      <ns0:r>
+        <ns0:rPr>
+          <ns0:sz ns0:val="22"/>
+        </ns0:rPr>
+        <ns0:t>Strong name: "InFanity" is catchy, short, and ties "fan" to "infinity" -- great brand recall.</ns0:t>
+      </ns0:r>
+    </ns0:p>
+    <ns0:p/>
+    <ns0:p>
+      <ns0:pPr>
+        <ns0:pStyle ns0:val="Heading1"/>
+        <ns0:jc ns0:val="left"/>
+      </ns0:pPr>
+      <ns0:r>
+        <ns0:t>2. Opportunities We See</ns0:t>
+      </ns0:r>
+    </ns0:p>
+    <ns0:p>
+      <ns0:pPr>
+        <ns0:spacing ns0:after="160" ns0:line="240" ns0:lineRule="auto"/>
+      </ns0:pPr>
+      <ns0:r>
+        <ns0:rPr>
+          <ns0:b ns0:val="0"/>
+          <ns0:i ns0:val="0"/>
+          <ns0:sz ns0:val="22"/>
+        </ns0:rPr>
+        <ns0:t>The current site is a single hero section. That is a clean start, but it leaves a lot of the story untold. Here are the biggest opportunities for improvement:</ns0:t>
+      </ns0:r>
+    </ns0:p>
+    <ns0:p>
+      <ns0:pPr>
+        <ns0:pStyle ns0:val="Heading2"/>
+        <ns0:jc ns0:val="left"/>
+      </ns0:pPr>
+      <ns0:r>
+        <ns0:t>Tell the full story</ns0:t>
+      </ns0:r>
+    </ns0:p>
+    <ns0:p>
+      <ns0:pPr>
+        <ns0:spacing ns0:after="160" ns0:line="240" ns0:lineRule="auto"/>
+      </ns0:pPr>
+      <ns0:r>
+        <ns0:rPr>
+          <ns0:b ns0:val="0"/>
+          <ns0:i ns0:val="0"/>
+          <ns0:sz ns0:val="22"/>
+        </ns0:rPr>
+        <ns0:t>Right now a visitor sees "Where Music Connects" and a download button. They do not know if this is a fan club, a messaging app, a ticketing tool, or a social network. A few sections explaining the core loop -- "discover artists -&gt; message them -&gt; unlock exclusive content" -- would dramatically improve conversion.</ns0:t>
+      </ns0:r>
+    </ns0:p>
+    <ns0:p>
+      <ns0:pPr>
+        <ns0:pStyle ns0:val="Heading2"/>
+        <ns0:jc ns0:val="left"/>
+      </ns0:pPr>
+      <ns0:r>
+        <ns0:t>Add trust signals</ns0:t>
+      </ns0:r>
+    </ns0:p>
+    <ns0:p>
+      <ns0:pPr>
+        <ns0:spacing ns0:after="160" ns0:line="240" ns0:lineRule="auto"/>
+      </ns0:pPr>
+      <ns0:r>
+        <ns0:rPr>
+          <ns0:b ns0:val="0"/>
+          <ns0:i ns0:val="0"/>
+          <ns0:sz ns0:val="22"/>
+        </ns0:rPr>
+        <ns0:t>For an app requesting downloads and likely social permissions, trust is essential. A privacy policy, an About page, and a simple contact email go a long way toward making users feel safe.</ns0:t>
+      </ns0:r>
+    </ns0:p>
+    <ns0:p>
+      <ns0:pPr>
+        <ns0:pStyle ns0:val="Heading2"/>
+        <ns0:jc ns0:val="left"/>
+      </ns0:pPr>
+      <ns0:r>
+        <ns0:t>Capture the non-downloaders</ns0:t>
+      </ns0:r>
+    </ns0:p>
+    <ns0:p>
+      <ns0:pPr>
+        <ns0:spacing ns0:after="160" ns0:line="240" ns0:lineRule="auto"/>
+      </ns0:pPr>
+      <ns0:r>
+        <ns0:rPr>
+          <ns0:b ns0:val="0"/>
+          <ns0:i ns0:val="0"/>
+          <ns0:sz ns0:val="22"/>
+        </ns0:rPr>
+        <ns0:t>Most visitors will not download on the first visit. A waitlist for phone users, a newsletter signup, or even just social links (TikTok, Instagram, Discord) would let InFanity stay in touch with curious visitors rather than losing them forever.</ns0:t>
+      </ns0:r>
+    </ns0:p>
+    <ns0:p>
+      <ns0:pPr>
+        <ns0:pStyle ns0:val="Heading2"/>
+        <ns0:jc ns0:val="left"/>
+      </ns0:pPr>
+      <ns0:r>
+        <ns0:t>Expand platform reach</ns0:t>
+      </ns0:r>
+    </ns0:p>
+    <ns0:p>
+      <ns0:pPr>
+        <ns0:spacing ns0:after="160" ns0:line="240" ns0:lineRule="auto"/>
+      </ns0:pPr>
+      <ns0:r>
+        <ns0:rPr>
+          <ns0:b ns0:val="0"/>
+          <ns0:i ns0:val="0"/>
+          <ns0:sz ns0:val="22"/>
+        </ns0:rPr>
+        <ns0:t>The site only links to the iOS App Store. Android represents roughly 70% of global mobile users. Even a simple "Android coming soon" waitlist signals inclusivity and captures demand.</ns0:t>
+      </ns0:r>
+    </ns0:p>
+    <ns0:p>
+      <ns0:pPr>
+        <ns0:pStyle ns0:val="Heading2"/>
+        <ns0:jc ns0:val="left"/>
+      </ns0:pPr>
+      <ns0:r>
+        <ns0:t>SEO and discoverability</ns0:t>
+      </ns0:r>
+    </ns0:p>
+    <ns0:p>
+      <ns0:pPr>
+        <ns0:spacing ns0:after="160" ns0:line="240" ns0:lineRule="auto"/>
+      </ns0:pPr>
+      <ns0:r>
+        <ns0:rPr>
+          <ns0:b ns0:val="0"/>
+          <ns0:i ns0:val="0"/>
+          <ns0:sz ns0:val="22"/>
+        </ns0:rPr>
+        <ns0:t>The meta description is literally "Where Music Connects." Adding keyword-rich copy, a blog, or landing pages for terms like "fan engagement app" or "direct artist messaging" would bring in organic traffic that currently goes to competitors.</ns0:t>
+      </ns0:r>
+    </ns0:p>
+    <ns0:p/>
+    <ns0:p>
+      <ns0:pPr>
+        <ns0:pStyle ns0:val="Heading1"/>
+        <ns0:jc ns0:val="left"/>
+      </ns0:pPr>
+      <ns0:r>
+        <ns0:t>3. How TorinWorks Can Help</ns0:t>
+      </ns0:r>
+    </ns0:p>
+    <ns0:p>
+      <ns0:pPr>
+        <ns0:spacing ns0:after="160" ns0:line="240" ns0:lineRule="auto"/>
+      </ns0:pPr>
+      <ns0:r>
+        <ns0:rPr>
+          <ns0:b ns0:val="0"/>
+          <ns0:i ns0:val="0"/>
+          <ns0:sz ns0:val="22"/>
+        </ns0:rPr>
+        <ns0:t>TorinWorks specializes in turning promising products into polished, conversion-ready web experiences. Here is how we would partner with InFanity:</ns0:t>
+      </ns0:r>
+    </ns0:p>
+    <ns0:p>
+      <ns0:pPr>
+        <ns0:pStyle ns0:val="Heading2"/>
+        <ns0:jc ns0:val="left"/>
+      </ns0:pPr>
+      <ns0:r>
+        <ns0:t>Phase 1: Foundation (Weeks 1-2)</ns0:t>
+      </ns0:r>
+    </ns0:p>
+    <ns0:p>
+      <ns0:pPr>
+        <ns0:pStyle ns0:val="ListBullet"/>
+        <ns0:spacing ns0:after="80"/>
+      </ns0:pPr>
+      <ns0:r>
+        <ns0:rPr>
+          <ns0:sz ns0:val="22"/>
+        </ns0:rPr>
+        <ns0:t>Expand the landing page into a full conversion funnel: Hero -&gt; How It Works -&gt; For Fans / For Artists -&gt; Social Proof -&gt; CTA.</ns0:t>
+      </ns0:r>
+    </ns0:p>
+    <ns0:p>
+      <ns0:pPr>
+        <ns0:pStyle ns0:val="ListBullet"/>
+        <ns0:spacing ns0:after="80"/>
+      </ns0:pPr>
+      <ns0:r>
+        <ns0:rPr>
+          <ns0:sz ns0:val="22"/>
+        </ns0:rPr>
+        <ns0:t>Clarify messaging so visitors understand the value proposition in under 10 seconds.</ns0:t>
+      </ns0:r>
+    </ns0:p>
+    <ns0:p>
+      <ns0:pPr>
+        <ns0:pStyle ns0:val="ListBullet"/>
+        <ns0:spacing ns0:after="80"/>
+      </ns0:pPr>
+      <ns0:r>
+        <ns0:rPr>
+          <ns0:sz ns0:val="22"/>
+        </ns0:rPr>
+        <ns0:t>Add essential trust pages: Privacy Policy, Terms, About, and Contact.</ns0:t>
+      </ns0:r>
+    </ns0:p>
+    <ns0:p>
+      <ns0:pPr>
+        <ns0:pStyle ns0:val="ListBullet"/>
+        <ns0:spacing ns0:after="80"/>
+      </ns0:pPr>
+      <ns0:r>
+        <ns0:rPr>
+          <ns0:sz ns0:val="22"/>
+        </ns0:rPr>
+        <ns0:t>Implement SEO basics: meta tags, structured data, sitemap, and keyword-optimized copy.</ns0:t>
+      </ns0:r>
+    </ns0:p>
+    <ns0:p>
+      <ns0:pPr>
+        <ns0:pStyle ns0:val="Heading2"/>
+        <ns0:jc ns0:val="left"/>
+      </ns0:pPr>
+      <ns0:r>
+        <ns0:t>Phase 2: Growth Engine (Month 1-3)</ns0:t>
+      </ns0:r>
+    </ns0:p>
+    <ns0:p>
+      <ns0:pPr>
+        <ns0:pStyle ns0:val="ListBullet"/>
+        <ns0:spacing ns0:after="80"/>
+      </ns0:pPr>
+      <ns0:r>
+        <ns0:rPr>
+          <ns0:sz ns0:val="22"/>
+        </ns0:rPr>
+        <ns0:t>Build waitlist and lead-capture flows for Android users, artists, and general newsletter subscribers.</ns0:t>
+      </ns0:r>
+    </ns0:p>
+    <ns0:p>
+      <ns0:pPr>
+        <ns0:pStyle ns0:val="ListBullet"/>
+        <ns0:spacing ns0:after="80"/>
+      </ns0:pPr>
+      <ns0:r>
+        <ns0:rPr>
+          <ns0:sz ns0:val="22"/>
+        </ns0:rPr>
+        <ns0:t>Set up analytics and conversion tracking so every design decision is data-informed.</ns0:t>
+      </ns0:r>
+    </ns0:p>
+    <ns0:p>
+      <ns0:pPr>
+        <ns0:pStyle ns0:val="ListBullet"/>
+        <ns0:spacing ns0:after="80"/>
+      </ns0:pPr>
+      <ns0:r>
+        <ns0:rPr>
+          <ns0:sz ns0:val="22"/>
+        </ns0:rPr>
+        <ns0:t>Create a content strategy -- blog posts, artist spotlights, case studies -- to drive organic search traffic.</ns0:t>
+      </ns0:r>
+    </ns0:p>
+    <ns0:p>
+      <ns0:pPr>
+        <ns0:pStyle ns0:val="ListBullet"/>
+        <ns0:spacing ns0:after="80"/>
+      </ns0:pPr>
+      <ns0:r>
+        <ns0:rPr>
+          <ns0:sz ns0:val="22"/>
+        </ns0:rPr>
+        <ns0:t>Establish a social proof pipeline: testimonial collection, partner artist logos, user-generated content.</ns0:t>
+      </ns0:r>
+    </ns0:p>
+    <ns0:p>
+      <ns0:pPr>
+        <ns0:pStyle ns0:val="Heading2"/>
+        <ns0:jc ns0:val="left"/>
+      </ns0:pPr>
+      <ns0:r>
+        <ns0:t>Phase 3: Scale (Ongoing)</ns0:t>
+      </ns0:r>
+    </ns0:p>
+    <ns0:p>
+      <ns0:pPr>
+        <ns0:pStyle ns0:val="ListBullet"/>
+        <ns0:spacing ns0:after="80"/>
+      </ns0:pPr>
+      <ns0:r>
+        <ns0:rPr>
+          <ns0:sz ns0:val="22"/>
+        </ns0:rPr>
+        <ns0:t>Develop a Progressive Web App (PWA) or web companion to serve phone users and desktop users.</ns0:t>
+      </ns0:r>
+    </ns0:p>
+    <ns0:p>
+      <ns0:pPr>
+        <ns0:pStyle ns0:val="ListBullet"/>
+        <ns0:spacing ns0:after="80"/>
+      </ns0:pPr>
+      <ns0:r>
+        <ns0:rPr>
+          <ns0:sz ns0:val="22"/>
+        </ns0:rPr>
+        <ns0:t>Integrate AI-powered features: sentiment analysis on fan messages, smart auto-replies for artists, personalized content recommendations.</ns0:t>
+      </ns0:r>
+    </ns0:p>
+    <ns0:p>
+      <ns0:pPr>
+        <ns0:pStyle ns0:val="ListBullet"/>
+        <ns0:spacing ns0:after="80"/>
+      </ns0:pPr>
+      <ns0:r>
+        <ns0:rPr>
+          <ns0:sz ns0:val="22"/>
+        </ns0:rPr>
+        <ns0:t>Build marketing automation: onboarding drip campaigns, re-engagement flows, artist activation sequences.</ns0:t>
+      </ns0:r>
+    </ns0:p>
+    <ns0:p>
+      <ns0:pPr>
+        <ns0:pStyle ns0:val="ListBullet"/>
+        <ns0:spacing ns0:after="80"/>
+      </ns0:pPr>
+      <ns0:r>
+        <ns0:rPr>
+          <ns0:sz ns0:val="22"/>
+        </ns0:rPr>
+        <ns0:t>Launch community features: Discord integration, fan club tooling, AMA events.</ns0:t>
+      </ns0:r>
+    </ns0:p>
+    <ns0:p/>
+    <ns0:p>
+      <ns0:pPr>
+        <ns0:pStyle ns0:val="Heading1"/>
+        <ns0:jc ns0:val="left"/>
+      </ns0:pPr>
+      <ns0:r>
+        <ns0:t>4. Why TorinWorks for InFanity</ns0:t>
+      </ns0:r>
+    </ns0:p>
+    <ns0:p>
+      <ns0:pPr>
+        <ns0:spacing ns0:after="160" ns0:line="240" ns0:lineRule="auto"/>
+      </ns0:pPr>
+      <ns0:r>
+        <ns0:rPr>
+          <ns0:b ns0:val="0"/>
+          <ns0:i ns0:val="0"/>
+          <ns0:sz ns0:val="22"/>
+        </ns0:rPr>
+        <ns0:t>TorinWorks does not just build websites -- we build growth infrastructure. For a mobile-first product like InFanity, the web layer is often the most neglected and highest-leverage piece. We help music and community apps become discoverable, trustworthy, and scalable.</ns0:t>
+      </ns0:r>
+    </ns0:p>
+    <ns0:p/>
+    <ns0:p>
+      <ns0:pPr>
+        <ns0:pStyle ns0:val="Heading1"/>
+        <ns0:jc ns0:val="left"/>
+      </ns0:pPr>
+      <ns0:r>
+        <ns0:t>5. Suggested Next Steps</ns0:t>
+      </ns0:r>
+    </ns0:p>
+    <ns0:p>
+      <ns0:pPr>
+        <ns0:pStyle ns0:val="ListBullet"/>
+        <ns0:spacing ns0:after="80"/>
+      </ns0:pPr>
+      <ns0:r>
+        <ns0:rPr>
+          <ns0:sz ns0:val="22"/>
+        </ns0:rPr>
+        <ns0:t>Send a short teardown note to InFanity offering the Phase 1 Foundation sprint.</ns0:t>
+      </ns0:r>
+    </ns0:p>
+    <ns0:p>
+      <ns0:pPr>
+        <ns0:pStyle ns0:val="ListBullet"/>
+        <ns0:spacing ns0:after="80"/>
+      </ns0:pPr>
+      <ns0:r>
+        <ns0:rPr>
+          <ns0:sz ns0:val="22"/>
+        </ns0:rPr>
+        <ns0:t>If they are open to it, schedule a 15-minute intro call to learn their roadmap and tailor the proposal.</ns0:t>
+      </ns0:r>
+    </ns0:p>
+    <ns0:p>
+      <ns0:pPr>
+        <ns0:pStyle ns0:val="ListBullet"/>
+        <ns0:spacing ns0:after="80"/>
+      </ns0:pPr>
+      <ns0:r>
+        <ns0:rPr>
+          <ns0:sz ns0:val="22"/>
+        </ns0:rPr>
+        <ns0:t>Prepare a 2-slide visual mockup of an expanded landing page to show immediate value.</ns0:t>
+      </ns0:r>
+    </ns0:p>
+    <ns0:p/>
+    <ns0:p>
+      <ns0:pPr>
+        <ns0:spacing ns0:after="160" ns0:line="240" ns0:lineRule="auto"/>
+      </ns0:pPr>
+      <ns0:r>
+        <ns0:rPr>
+          <ns0:b ns0:val="0"/>
+          <ns0:i/>
+          <ns0:sz ns0:val="20"/>
+        </ns0:rPr>
+        <ns0:t>For questions or to discuss this review, reach out to Lesley at TorinWorks.</ns0:t>
+      </ns0:r>
+    </ns0:p>
+    <ns0:p>
+      <ns0:pPr>
+        <ns0:spacing ns0:after="160" ns0:line="240" ns0:lineRule="auto"/>
+      </ns0:pPr>
+      <ns0:r>
+        <ns0:rPr>
+          <ns0:b ns0:val="0"/>
+          <ns0:i/>
+          <ns0:sz ns0:val="20"/>
+        </ns0:rPr>
+        <ns0:t>torinworks.com</ns0:t>
+      </ns0:r>
+    </ns0:p>
+    <ns0:sectPr ns0:rsidR="00FC693F" ns0:rsidRPr="0006063C" ns0:rsidSect="00034616">
+      <ns0:pgSz ns0:w="12240" ns0:h="15840"/>
+      <ns0:pgMar ns0:top="1440" ns0:right="1800" ns0:bottom="1440" ns0:left="1800" ns0:header="720" ns0:footer="720" ns0:gutter="0"/>
+      <ns0:cols ns0:space="720"/>
+      <ns0:docGrid ns0:linePitch="360"/>
+    </ns0:sectPr>
+  </ns0:body>
+</ns0:document>
 </file>
 
 <file path=word/numbering.xml><?xml version="1.0" encoding="utf-8"?>

</xml_diff>

<commit_message>
fix: remove Suggested Next Steps section for client share
</commit_message>
<xml_diff>
--- a/docs/infanity-site-review.docx
+++ b/docs/infanity-site-review.docx
@@ -438,52 +438,6 @@
     <ns0:p/>
     <ns0:p>
       <ns0:pPr>
-        <ns0:pStyle ns0:val="Heading1"/>
-        <ns0:jc ns0:val="left"/>
-      </ns0:pPr>
-      <ns0:r>
-        <ns0:t>5. Suggested Next Steps</ns0:t>
-      </ns0:r>
-    </ns0:p>
-    <ns0:p>
-      <ns0:pPr>
-        <ns0:pStyle ns0:val="ListBullet"/>
-        <ns0:spacing ns0:after="80"/>
-      </ns0:pPr>
-      <ns0:r>
-        <ns0:rPr>
-          <ns0:sz ns0:val="22"/>
-        </ns0:rPr>
-        <ns0:t>Send a short teardown note to InFanity offering the Phase 1 Foundation sprint.</ns0:t>
-      </ns0:r>
-    </ns0:p>
-    <ns0:p>
-      <ns0:pPr>
-        <ns0:pStyle ns0:val="ListBullet"/>
-        <ns0:spacing ns0:after="80"/>
-      </ns0:pPr>
-      <ns0:r>
-        <ns0:rPr>
-          <ns0:sz ns0:val="22"/>
-        </ns0:rPr>
-        <ns0:t>If they are open to it, schedule a 15-minute intro call to learn their roadmap and tailor the proposal.</ns0:t>
-      </ns0:r>
-    </ns0:p>
-    <ns0:p>
-      <ns0:pPr>
-        <ns0:pStyle ns0:val="ListBullet"/>
-        <ns0:spacing ns0:after="80"/>
-      </ns0:pPr>
-      <ns0:r>
-        <ns0:rPr>
-          <ns0:sz ns0:val="22"/>
-        </ns0:rPr>
-        <ns0:t>Prepare a 2-slide visual mockup of an expanded landing page to show immediate value.</ns0:t>
-      </ns0:r>
-    </ns0:p>
-    <ns0:p/>
-    <ns0:p>
-      <ns0:pPr>
         <ns0:spacing ns0:after="160" ns0:line="240" ns0:lineRule="auto"/>
       </ns0:pPr>
       <ns0:r>

</xml_diff>